<commit_message>
Re-render Mermaid figures at high resolution for legibility.
The diagram PNGs were previously rendered at ~600px wide and were unreadable when
embedded. Re-rendered all 12 Mermaid diagrams with mermaid-cli (mmdc) at scale 3
(e.g. six_findings 600x536 -> 2352x2073; friendly_input_loop 600x144 -> 2352x555;
repo_map 600x120 -> 2352x465; substrate_read_write 600x904 -> 2352x3384), updating
both docs/diagrams/rendered/ and docs/report/figures/, and regenerated nous_report.docx
so it embeds the high-resolution images. Diagram sources (.mmd), captions, and all
numbers are unchanged; the two matplotlib charts were already high-resolution.

Co-Authored-By: Claude Opus 4.8 <noreply@anthropic.com>
</commit_message>
<xml_diff>
--- a/docs/report/nous_report.docx
+++ b/docs/report/nous_report.docx
@@ -391,7 +391,7 @@
       <w:r>
         <w:drawing>
           <wp:inline xmlns:a="http://schemas.openxmlformats.org/drawingml/2006/main" xmlns:pic="http://schemas.openxmlformats.org/drawingml/2006/picture">
-            <wp:extent cx="1786721" cy="7315198"/>
+            <wp:extent cx="1793068" cy="7315198"/>
             <wp:docPr id="1" name="Picture 1"/>
             <wp:cNvGraphicFramePr>
               <a:graphicFrameLocks noChangeAspect="1"/>
@@ -412,7 +412,7 @@
                   <pic:spPr>
                     <a:xfrm>
                       <a:off x="0" y="0"/>
-                      <a:ext cx="1786721" cy="7315198"/>
+                      <a:ext cx="1793068" cy="7315198"/>
                     </a:xfrm>
                     <a:prstGeom prst="rect"/>
                   </pic:spPr>
@@ -552,7 +552,7 @@
       <w:r>
         <w:drawing>
           <wp:inline xmlns:a="http://schemas.openxmlformats.org/drawingml/2006/main" xmlns:pic="http://schemas.openxmlformats.org/drawingml/2006/picture">
-            <wp:extent cx="2081560" cy="7315197"/>
+            <wp:extent cx="2035162" cy="7315198"/>
             <wp:docPr id="2" name="Picture 2"/>
             <wp:cNvGraphicFramePr>
               <a:graphicFrameLocks noChangeAspect="1"/>
@@ -573,7 +573,7 @@
                   <pic:spPr>
                     <a:xfrm>
                       <a:off x="0" y="0"/>
-                      <a:ext cx="2081560" cy="7315197"/>
+                      <a:ext cx="2035162" cy="7315198"/>
                     </a:xfrm>
                     <a:prstGeom prst="rect"/>
                   </pic:spPr>
@@ -604,7 +604,7 @@
       <w:r>
         <w:drawing>
           <wp:inline xmlns:a="http://schemas.openxmlformats.org/drawingml/2006/main" xmlns:pic="http://schemas.openxmlformats.org/drawingml/2006/picture">
-            <wp:extent cx="4855221" cy="7315200"/>
+            <wp:extent cx="5084323" cy="7315200"/>
             <wp:docPr id="3" name="Picture 3"/>
             <wp:cNvGraphicFramePr>
               <a:graphicFrameLocks noChangeAspect="1"/>
@@ -625,7 +625,7 @@
                   <pic:spPr>
                     <a:xfrm>
                       <a:off x="0" y="0"/>
-                      <a:ext cx="4855221" cy="7315200"/>
+                      <a:ext cx="5084323" cy="7315200"/>
                     </a:xfrm>
                     <a:prstGeom prst="rect"/>
                   </pic:spPr>
@@ -837,7 +837,7 @@
       <w:r>
         <w:drawing>
           <wp:inline xmlns:a="http://schemas.openxmlformats.org/drawingml/2006/main" xmlns:pic="http://schemas.openxmlformats.org/drawingml/2006/picture">
-            <wp:extent cx="4303058" cy="7315199"/>
+            <wp:extent cx="4450177" cy="7315199"/>
             <wp:docPr id="4" name="Picture 4"/>
             <wp:cNvGraphicFramePr>
               <a:graphicFrameLocks noChangeAspect="1"/>
@@ -858,7 +858,7 @@
                   <pic:spPr>
                     <a:xfrm>
                       <a:off x="0" y="0"/>
-                      <a:ext cx="4303058" cy="7315199"/>
+                      <a:ext cx="4450177" cy="7315199"/>
                     </a:xfrm>
                     <a:prstGeom prst="rect"/>
                   </pic:spPr>
@@ -995,7 +995,7 @@
       <w:r>
         <w:drawing>
           <wp:inline xmlns:a="http://schemas.openxmlformats.org/drawingml/2006/main" xmlns:pic="http://schemas.openxmlformats.org/drawingml/2006/picture">
-            <wp:extent cx="5760720" cy="1382573"/>
+            <wp:extent cx="5760720" cy="1359354"/>
             <wp:docPr id="5" name="Picture 5"/>
             <wp:cNvGraphicFramePr>
               <a:graphicFrameLocks noChangeAspect="1"/>
@@ -1016,7 +1016,7 @@
                   <pic:spPr>
                     <a:xfrm>
                       <a:off x="0" y="0"/>
-                      <a:ext cx="5760720" cy="1382573"/>
+                      <a:ext cx="5760720" cy="1359354"/>
                     </a:xfrm>
                     <a:prstGeom prst="rect"/>
                   </pic:spPr>
@@ -1055,7 +1055,7 @@
       <w:r>
         <w:drawing>
           <wp:inline xmlns:a="http://schemas.openxmlformats.org/drawingml/2006/main" xmlns:pic="http://schemas.openxmlformats.org/drawingml/2006/picture">
-            <wp:extent cx="5760720" cy="5146243"/>
+            <wp:extent cx="5760720" cy="5077369"/>
             <wp:docPr id="6" name="Picture 6"/>
             <wp:cNvGraphicFramePr>
               <a:graphicFrameLocks noChangeAspect="1"/>
@@ -1076,7 +1076,7 @@
                   <pic:spPr>
                     <a:xfrm>
                       <a:off x="0" y="0"/>
-                      <a:ext cx="5760720" cy="5146243"/>
+                      <a:ext cx="5760720" cy="5077369"/>
                     </a:xfrm>
                     <a:prstGeom prst="rect"/>
                   </pic:spPr>
@@ -1200,7 +1200,7 @@
       <w:r>
         <w:drawing>
           <wp:inline xmlns:a="http://schemas.openxmlformats.org/drawingml/2006/main" xmlns:pic="http://schemas.openxmlformats.org/drawingml/2006/picture">
-            <wp:extent cx="5760720" cy="5607101"/>
+            <wp:extent cx="5760720" cy="5547632"/>
             <wp:docPr id="7" name="Picture 7"/>
             <wp:cNvGraphicFramePr>
               <a:graphicFrameLocks noChangeAspect="1"/>
@@ -1221,7 +1221,7 @@
                   <pic:spPr>
                     <a:xfrm>
                       <a:off x="0" y="0"/>
-                      <a:ext cx="5760720" cy="5607101"/>
+                      <a:ext cx="5760720" cy="5547632"/>
                     </a:xfrm>
                     <a:prstGeom prst="rect"/>
                   </pic:spPr>
@@ -1345,7 +1345,7 @@
       <w:r>
         <w:drawing>
           <wp:inline xmlns:a="http://schemas.openxmlformats.org/drawingml/2006/main" xmlns:pic="http://schemas.openxmlformats.org/drawingml/2006/picture">
-            <wp:extent cx="5760720" cy="5607101"/>
+            <wp:extent cx="5760720" cy="5565140"/>
             <wp:docPr id="8" name="Picture 8"/>
             <wp:cNvGraphicFramePr>
               <a:graphicFrameLocks noChangeAspect="1"/>
@@ -1366,7 +1366,7 @@
                   <pic:spPr>
                     <a:xfrm>
                       <a:off x="0" y="0"/>
-                      <a:ext cx="5760720" cy="5607101"/>
+                      <a:ext cx="5760720" cy="5565140"/>
                     </a:xfrm>
                     <a:prstGeom prst="rect"/>
                   </pic:spPr>
@@ -1676,7 +1676,7 @@
       <w:r>
         <w:drawing>
           <wp:inline xmlns:a="http://schemas.openxmlformats.org/drawingml/2006/main" xmlns:pic="http://schemas.openxmlformats.org/drawingml/2006/picture">
-            <wp:extent cx="5598367" cy="7315200"/>
+            <wp:extent cx="5760720" cy="7281727"/>
             <wp:docPr id="9" name="Picture 9"/>
             <wp:cNvGraphicFramePr>
               <a:graphicFrameLocks noChangeAspect="1"/>
@@ -1697,7 +1697,7 @@
                   <pic:spPr>
                     <a:xfrm>
                       <a:off x="0" y="0"/>
-                      <a:ext cx="5598367" cy="7315200"/>
+                      <a:ext cx="5760720" cy="7281727"/>
                     </a:xfrm>
                     <a:prstGeom prst="rect"/>
                   </pic:spPr>
@@ -1821,7 +1821,7 @@
       <w:r>
         <w:drawing>
           <wp:inline xmlns:a="http://schemas.openxmlformats.org/drawingml/2006/main" xmlns:pic="http://schemas.openxmlformats.org/drawingml/2006/picture">
-            <wp:extent cx="969738" cy="7315198"/>
+            <wp:extent cx="971605" cy="7315200"/>
             <wp:docPr id="10" name="Picture 10"/>
             <wp:cNvGraphicFramePr>
               <a:graphicFrameLocks noChangeAspect="1"/>
@@ -1842,7 +1842,7 @@
                   <pic:spPr>
                     <a:xfrm>
                       <a:off x="0" y="0"/>
-                      <a:ext cx="969738" cy="7315198"/>
+                      <a:ext cx="971605" cy="7315200"/>
                     </a:xfrm>
                     <a:prstGeom prst="rect"/>
                   </pic:spPr>
@@ -2540,7 +2540,7 @@
       <w:r>
         <w:drawing>
           <wp:inline xmlns:a="http://schemas.openxmlformats.org/drawingml/2006/main" xmlns:pic="http://schemas.openxmlformats.org/drawingml/2006/picture">
-            <wp:extent cx="3574201" cy="7315198"/>
+            <wp:extent cx="3384741" cy="7315198"/>
             <wp:docPr id="13" name="Picture 13"/>
             <wp:cNvGraphicFramePr>
               <a:graphicFrameLocks noChangeAspect="1"/>
@@ -2561,7 +2561,7 @@
                   <pic:spPr>
                     <a:xfrm>
                       <a:off x="0" y="0"/>
-                      <a:ext cx="3574201" cy="7315198"/>
+                      <a:ext cx="3384741" cy="7315198"/>
                     </a:xfrm>
                     <a:prstGeom prst="rect"/>
                   </pic:spPr>
@@ -3590,7 +3590,7 @@
       <w:r>
         <w:drawing>
           <wp:inline xmlns:a="http://schemas.openxmlformats.org/drawingml/2006/main" xmlns:pic="http://schemas.openxmlformats.org/drawingml/2006/picture">
-            <wp:extent cx="5760720" cy="1152144"/>
+            <wp:extent cx="5760720" cy="1138918"/>
             <wp:docPr id="14" name="Picture 14"/>
             <wp:cNvGraphicFramePr>
               <a:graphicFrameLocks noChangeAspect="1"/>
@@ -3611,7 +3611,7 @@
                   <pic:spPr>
                     <a:xfrm>
                       <a:off x="0" y="0"/>
-                      <a:ext cx="5760720" cy="1152144"/>
+                      <a:ext cx="5760720" cy="1138918"/>
                     </a:xfrm>
                     <a:prstGeom prst="rect"/>
                   </pic:spPr>

</xml_diff>

<commit_message>
Fix layout collision in substrate_read_write diagram.
The "read-only view computed forward from here" edge label overlapped the floating
"sticky closure" note box. Reworked the layout so the note (now a styled STICKY
CLOSURE box) and the OUT node sit inside their respective WRITE/READ subgraphs, and
shortened the two cross-edges' labels onto two lines. No content/meaning change.
Re-rendered at scale 3 and regenerated nous_report.docx.

Co-Authored-By: Claude Opus 4.8 <noreply@anthropic.com>
</commit_message>
<xml_diff>
--- a/docs/report/nous_report.docx
+++ b/docs/report/nous_report.docx
@@ -604,7 +604,7 @@
       <w:r>
         <w:drawing>
           <wp:inline xmlns:a="http://schemas.openxmlformats.org/drawingml/2006/main" xmlns:pic="http://schemas.openxmlformats.org/drawingml/2006/picture">
-            <wp:extent cx="5084323" cy="7315200"/>
+            <wp:extent cx="5232770" cy="7315199"/>
             <wp:docPr id="3" name="Picture 3"/>
             <wp:cNvGraphicFramePr>
               <a:graphicFrameLocks noChangeAspect="1"/>
@@ -625,7 +625,7 @@
                   <pic:spPr>
                     <a:xfrm>
                       <a:off x="0" y="0"/>
-                      <a:ext cx="5084323" cy="7315200"/>
+                      <a:ext cx="5232770" cy="7315199"/>
                     </a:xfrm>
                     <a:prstGeom prst="rect"/>
                   </pic:spPr>

</xml_diff>

<commit_message>
Style pass: remove em dashes; bold lead-ins use colons (docs + figures).
Per review feedback, removed every em dash (—) from the authored documentation and
the figures, and changed bold inline lead-in labels to end with ":" instead of "."
(e.g. "Motivation:" not "Motivation."). Applied to README.md, docs/REPORT.md,
docs/ARCHITECTURE.md, docs/METHODOLOGY.md, docs/design/README.md, the LaTeX report,
build_docx.py (docx regenerated), all 12 Mermaid diagram sources, and the 2 matplotlib
chart scripts; all 14 figures were re-rendered. Em dashes were replaced contextually:
colon for introductions, parentheses for asides, comma before conjunctions. En dashes
in numeric/reference ranges are preserved. The verbatim prototype source (src/, tests/),
the 13 design docs, and TEST_OUTPUT.txt are intentionally left unchanged (verbatim
artifacts). No numbers or claims changed.
</commit_message>
<xml_diff>
--- a/docs/report/nous_report.docx
+++ b/docs/report/nous_report.docx
@@ -51,7 +51,7 @@
         <w:rPr>
           <w:i w:val="0"/>
         </w:rPr>
-        <w:t>This report describes Nous, a dependency-free Python prototype of a memory-and-activation substrate for a cognitive architecture, and — more centrally — the software-engineering methodology used to build it. Nous comprises four layers: a graph substrate store of concept nodes and weighted “roads”; a deterministic spreading-activation engine; a multi-source activation field; and a thin end-to-end perceive → activate → form coalitions → select a thought slice. The lower two layers are verified, by an adversarial property-style test suite, for three concrete properties: determinism (identical output across process runs, confirmed in fresh interpreters under randomized hash seeds), integrity (graph indices stay mutually consistent across every mutation), and purity (reads never mutate stored state). The upper two layers are exploratory: they run and are deterministic, but their cognitive meaningfulness is explicitly not claimed — and on clustered real input the end-to-end slice produces an incoherent “thought,” recorded as an asserted negative result / known limitation, not a contribution. The central finding is a recurring failure mode — a component that passes on a friendly, hand-chosen input and fails on an adversarial or system-generated one — and the two practices that caught it: adversarial/property-based testing (including cross-process determinism and read-purity checks) and loop-closure (driving each stage with system-generated rather than hand-placed inputs). Together they exposed six distinct structural bugs that ordinary happy-path tests pass over. The artifact’s verified totals: 130 assertions across 56 test functions, all passing, in five suites.</w:t>
+        <w:t>This report describes Nous, a dependency-free Python prototype of a memory-and-activation substrate for a cognitive architecture, and (more centrally) the software-engineering methodology used to build it. Nous comprises four layers: a graph substrate store of concept nodes and weighted “roads”; a deterministic spreading-activation engine; a multi-source activation field; and a thin end-to-end perceive → activate → form coalitions → select a thought slice. The lower two layers are verified, by an adversarial property-style test suite, for three concrete properties: determinism (identical output across process runs, confirmed in fresh interpreters under randomized hash seeds), integrity (graph indices stay mutually consistent across every mutation), and purity (reads never mutate stored state). The upper two layers are exploratory: they run and are deterministic, but their cognitive meaningfulness is explicitly not claimed, and on clustered real input the end-to-end slice produces an incoherent “thought,” recorded as an asserted negative result / known limitation, not a contribution. The central finding is a recurring failure mode: a component that passes on a friendly, hand-chosen input and fails on an adversarial or system-generated one, and the two practices that caught it: adversarial/property-based testing (including cross-process determinism and read-purity checks) and loop-closure (driving each stage with system-generated rather than hand-placed inputs). Together they exposed six distinct structural bugs that ordinary happy-path tests pass over. The artifact’s verified totals: 130 assertions across 56 test functions, all passing, in five suites.</w:t>
       </w:r>
     </w:p>
     <w:p>
@@ -81,13 +81,13 @@
         <w:rPr>
           <w:b/>
         </w:rPr>
-        <w:t>Motivation.</w:t>
+        <w:t>Motivation:</w:t>
       </w:r>
       <w:r>
         <w:rPr>
           <w:i w:val="0"/>
         </w:rPr>
-        <w:t xml:space="preserve"> Cognitive-architecture components — graph memories, spreading activation, clustering into “coalitions” — are easy to implement in a way that looks correct on a hand-built example and is quietly wrong in structure: it double-counts, it depends on iteration order, it bakes the answer into the input. These are bugs in the shape of the algorithm, and they survive happy-path tests. This project answers in the affirmative whether a disciplined, adversarial, property-oriented test process can surface such bugs early and force honest scoping.</w:t>
+        <w:t xml:space="preserve"> Cognitive-architecture components (graph memories, spreading activation, clustering into “coalitions”) are easy to implement in a way that looks correct on a hand-built example and is quietly wrong in structure: it double-counts, it depends on iteration order, it bakes the answer into the input. These are bugs in the shape of the algorithm, and they survive happy-path tests. This project answers in the affirmative whether a disciplined, adversarial, property-oriented test process can surface such bugs early and force honest scoping.</w:t>
       </w:r>
     </w:p>
     <w:p>
@@ -98,7 +98,7 @@
         <w:rPr>
           <w:b/>
         </w:rPr>
-        <w:t>Aspiration vs. built reality.</w:t>
+        <w:t>Aspiration vs. built reality:</w:t>
       </w:r>
       <w:r>
         <w:rPr>
@@ -115,7 +115,7 @@
         <w:rPr>
           <w:i w:val="0"/>
         </w:rPr>
-        <w:t>Scope and non-claims (binding).</w:t>
+        <w:t>Scope and non-claims (binding):</w:t>
       </w:r>
     </w:p>
     <w:p>
@@ -142,7 +142,7 @@
         <w:spacing w:after="60"/>
       </w:pPr>
       <w:r>
-        <w:t>The substrate store and spreading-activation engine are proven deterministic, integrity-preserving, and pure — claims about mechanism.</w:t>
+        <w:t>The substrate store and spreading-activation engine are proven deterministic, integrity-preserving, and pure: claims about mechanism.</w:t>
       </w:r>
     </w:p>
     <w:p>
@@ -171,7 +171,7 @@
         <w:rPr>
           <w:i w:val="0"/>
         </w:rPr>
-        <w:t>Contributions (methodology first).</w:t>
+        <w:t>Contributions (methodology first):</w:t>
       </w:r>
     </w:p>
     <w:p>
@@ -180,7 +180,7 @@
         <w:spacing w:after="60"/>
       </w:pPr>
       <w:r>
-        <w:t>A software-engineering experience report showing that adversarial/property-based testing — determinism verified across process hash seeds, and read-purity verified by hammering reads — and loop-closure caught a sequence of six structural bugs in a memory/activation substrate.</w:t>
+        <w:t>A software-engineering experience report showing that adversarial/property-based testing: determinism verified across process hash seeds, and read-purity verified by hammering reads: and loop-closure caught a sequence of six structural bugs in a memory/activation substrate.</w:t>
       </w:r>
     </w:p>
     <w:p>
@@ -237,13 +237,13 @@
         <w:rPr>
           <w:b/>
         </w:rPr>
-        <w:t>Complementary Learning Systems (CLS).</w:t>
+        <w:t>Complementary Learning Systems (CLS):</w:t>
       </w:r>
       <w:r>
         <w:rPr>
           <w:i w:val="0"/>
         </w:rPr>
-        <w:t xml:space="preserve"> The fast/slow split between a rapidly-learning episodic system and a slowly-consolidating semantic one [1], updated for intelligent-agent design in [2], inspires Nous’s separation of activation (what lights up now) from consolidation (what is later reinforced). In the prototype this is only a strict rule — spreading activation is a pure read and never strengthens what it touches.</w:t>
+        <w:t xml:space="preserve"> The fast/slow split between a rapidly-learning episodic system and a slowly-consolidating semantic one [1], updated for intelligent-agent design in [2], inspires Nous’s separation of activation (what lights up now) from consolidation (what is later reinforced). In the prototype this is only a strict rule: spreading activation is a pure read and never strengthens what it touches.</w:t>
       </w:r>
     </w:p>
     <w:p>
@@ -254,7 +254,7 @@
         <w:rPr>
           <w:b/>
         </w:rPr>
-        <w:t>Synaptic Tagging and Capture (STC).</w:t>
+        <w:t>Synaptic Tagging and Capture (STC):</w:t>
       </w:r>
       <w:r>
         <w:rPr>
@@ -271,7 +271,7 @@
         <w:rPr>
           <w:b/>
         </w:rPr>
-        <w:t>Global Workspace Theory (GWT).</w:t>
+        <w:t>Global Workspace Theory (GWT):</w:t>
       </w:r>
       <w:r>
         <w:rPr>
@@ -288,7 +288,7 @@
         <w:rPr>
           <w:b/>
         </w:rPr>
-        <w:t>LIDA cognitive cycle.</w:t>
+        <w:t>LIDA cognitive cycle:</w:t>
       </w:r>
       <w:r>
         <w:rPr>
@@ -305,7 +305,7 @@
         <w:rPr>
           <w:b/>
         </w:rPr>
-        <w:t>Cognitive architectures.</w:t>
+        <w:t>Cognitive architectures:</w:t>
       </w:r>
       <w:r>
         <w:rPr>
@@ -322,7 +322,7 @@
         <w:rPr>
           <w:b/>
         </w:rPr>
-        <w:t>Spreading-activation theory.</w:t>
+        <w:t>Spreading-activation theory:</w:t>
       </w:r>
       <w:r>
         <w:rPr>
@@ -339,7 +339,7 @@
         <w:rPr>
           <w:b/>
         </w:rPr>
-        <w:t>Arousal and plasticity.</w:t>
+        <w:t>Arousal and plasticity:</w:t>
       </w:r>
       <w:r>
         <w:rPr>
@@ -356,7 +356,7 @@
         <w:rPr>
           <w:b/>
         </w:rPr>
-        <w:t>Semantic priming.</w:t>
+        <w:t>Semantic priming:</w:t>
       </w:r>
       <w:r>
         <w:rPr>
@@ -433,7 +433,7 @@
           <w:i/>
           <w:sz w:val="18"/>
         </w:rPr>
-        <w:t>Figure 1 — The four-layer stack and the honest boundary. Layers 1–2 (substrate store, spreading activation) are PROVEN (determinism, integrity, purity); layers 3–4 (multi-source field, end-to-end slice) are EXPLORATORY. It establishes where verification stops; it does NOT claim the exploratory layers are cognitively meaningful.</w:t>
+        <w:t>Figure 1: The four-layer stack and the honest boundary. Layers 1–2 (substrate store, spreading activation) are PROVEN (determinism, integrity, purity); layers 3–4 (multi-source field, end-to-end slice) are EXPLORATORY. It establishes where verification stops; it does NOT claim the exploratory layers are cognitively meaningful.</w:t>
       </w:r>
     </w:p>
     <w:p>
@@ -464,7 +464,7 @@
         <w:rPr>
           <w:b/>
         </w:rPr>
-        <w:t xml:space="preserve">Nodes and roads. </w:t>
+        <w:t xml:space="preserve">Nodes and roads: </w:t>
       </w:r>
       <w:r>
         <w:t>A Node is an always-neutral unit of information with a stable identity and content. A Road is a directed edge source → target carrying a scalar strength (a new road starts at 0.05) and a multi-valued emotional life charges (named feelings → intensity in [-1, 1]), from which an aggregate valence is derived. One road per (source, target) pair; the reverse is a distinct road.</w:t>
@@ -479,7 +479,7 @@
         <w:rPr>
           <w:b/>
         </w:rPr>
-        <w:t xml:space="preserve">Stable identity vs. ordering. </w:t>
+        <w:t xml:space="preserve">Stable identity vs. ordering: </w:t>
       </w:r>
       <w:r>
         <w:t>Every node and road has a stable uuid4 identity and is never addressed by position; a stale handle resolves to NotFound, never to a wrong object. Formation order is a separate integer creation_seq, kept distinct from identity so ordering never falls back to a uuid.</w:t>
@@ -494,7 +494,7 @@
         <w:rPr>
           <w:b/>
         </w:rPr>
-        <w:t xml:space="preserve">Lazy, pure-read decay. </w:t>
+        <w:t xml:space="preserve">Lazy, pure-read decay: </w:t>
       </w:r>
       <w:r>
         <w:t>Roads decay with elapsed time, but decay is computed on access as a read-only view: a read returns a copy carrying decayed values and never writes. The strength time-constant scales steeply with strength, so a highway is far more stable than a dirt track. This purity is load-bearing (finding a).</w:t>
@@ -509,7 +509,7 @@
         <w:rPr>
           <w:b/>
         </w:rPr>
-        <w:t xml:space="preserve">Sticky closure. </w:t>
+        <w:t xml:space="preserve">Sticky closure: </w:t>
       </w:r>
       <w:r>
         <w:t>A strongly-negative crossing (or one-shot trauma) closes a road; closure is re-evaluated only on an active crossing, never by a read or by time, and only an active positive crossing reopens it.</w:t>
@@ -524,7 +524,7 @@
         <w:rPr>
           <w:b/>
         </w:rPr>
-        <w:t xml:space="preserve">Pin guard and integrity. </w:t>
+        <w:t xml:space="preserve">Pin guard and integrity: </w:t>
       </w:r>
       <w:r>
         <w:t>remove_node refuses to delete a pinned node; adjacency, dedup, and designation consistency are asserted incrementally on every mutation, with a full-graph scan available offline.</w:t>
@@ -539,7 +539,7 @@
         <w:rPr>
           <w:b/>
         </w:rPr>
-        <w:t xml:space="preserve">Atomicity. </w:t>
+        <w:t xml:space="preserve">Atomicity: </w:t>
       </w:r>
       <w:r>
         <w:t>Every mutation is a synchronous method with no await inside, making each mutation atomic by construction under single-threaded asyncio.</w:t>
@@ -594,7 +594,7 @@
           <w:i/>
           <w:sz w:val="18"/>
         </w:rPr>
-        <w:t>Figure 2 — Substrate data model. The Node and Road fields; identity (uuid4) is deliberately separate from ordering (creation_seq). Describes the data structures only.</w:t>
+        <w:t>Figure 2: Substrate data model. The Node and Road fields; identity (uuid4) is deliberately separate from ordering (creation_seq). Describes the data structures only.</w:t>
       </w:r>
     </w:p>
     <w:p>
@@ -646,7 +646,7 @@
           <w:i/>
           <w:sz w:val="18"/>
         </w:rPr>
-        <w:t>Figure 3 — Read vs. write paths (the purity invariant). Reads compute decay into a copy and never mutate; only writes persist decay; closure changes only on an active crossing. Visualizes finding (a); it proves a mechanism property, not anything about cognition.</w:t>
+        <w:t>Figure 3: Read vs. write paths (the purity invariant). Reads compute decay into a copy and never mutate; only writes persist decay; closure changes only on an active crossing. Visualizes finding (a); it proves a mechanism property, not anything about cognition.</w:t>
       </w:r>
     </w:p>
     <w:p>
@@ -677,7 +677,7 @@
         <w:rPr>
           <w:b/>
         </w:rPr>
-        <w:t xml:space="preserve">Convergence sums. </w:t>
+        <w:t xml:space="preserve">Convergence sums: </w:t>
       </w:r>
       <w:r>
         <w:t>Activation arriving at a node from several paths is summed.</w:t>
@@ -692,7 +692,7 @@
         <w:rPr>
           <w:b/>
         </w:rPr>
-        <w:t xml:space="preserve">Hop-layered single-expansion. </w:t>
+        <w:t xml:space="preserve">Hop-layered single-expansion: </w:t>
       </w:r>
       <w:r>
         <w:t>The wave expands in hop layers; all hop-k contributions accumulate before any hop-k node expands, each node expands exactly once, and a per-layer frozen snapshot is used so same-hop edges cannot leak iteration order into the result. Equal-length convergence is exact, and the algorithm is a deterministic function of store state. This replaced an earlier priority-frontier design (findings b, c).</w:t>
@@ -707,7 +707,7 @@
         <w:rPr>
           <w:b/>
         </w:rPr>
-        <w:t xml:space="preserve">Two attenuators. </w:t>
+        <w:t xml:space="preserve">Two attenuators: </w:t>
       </w:r>
       <w:r>
         <w:t>Transmitted activation is outgoing × road.strength × decay_per_hop: road.strength is edge conductance; decay_per_hop is a global distance penalty. Kept separate deliberately.</w:t>
@@ -722,7 +722,7 @@
         <w:rPr>
           <w:b/>
         </w:rPr>
-        <w:t xml:space="preserve">Leaky closure. </w:t>
+        <w:t xml:space="preserve">Leaky closure: </w:t>
       </w:r>
       <w:r>
         <w:t>A single swappable policy governs closed roads: below a breakthrough threshold nothing crosses; above it, a small attenuated fraction leaks through and is logged. The constants are uncalibrated guesses on probation; tests pin only the qualitative regime.</w:t>
@@ -737,7 +737,7 @@
         <w:rPr>
           <w:b/>
         </w:rPr>
-        <w:t xml:space="preserve">Flow recording. </w:t>
+        <w:t xml:space="preserve">Flow recording: </w:t>
       </w:r>
       <w:r>
         <w:t>The engine records, per edge, the activation actually transmitted (flow), distinct from static topology. Downstream consumers read flow, not raw edges.</w:t>
@@ -752,7 +752,7 @@
         <w:rPr>
           <w:b/>
         </w:rPr>
-        <w:t xml:space="preserve">Locality. </w:t>
+        <w:t xml:space="preserve">Locality: </w:t>
       </w:r>
       <w:r>
         <w:t>A hop budget and an activation floor keep the spread local, which makes it affordable in pure Python.</w:t>
@@ -794,7 +794,7 @@
         <w:rPr>
           <w:b/>
         </w:rPr>
-        <w:t xml:space="preserve">Coalition formation. </w:t>
+        <w:t xml:space="preserve">Coalition formation: </w:t>
       </w:r>
       <w:r>
         <w:t>Coalition formation groups co-activated nodes via a flow-cut segmentation of a single spread or a group-by-basin path for the multi-source field. Every output-affecting order is an explicit total order over intrinsic keys (activation, then creation_seq), never set-iteration order.</w:t>
@@ -809,10 +809,10 @@
         <w:rPr>
           <w:b/>
         </w:rPr>
-        <w:t xml:space="preserve">Perception. </w:t>
+        <w:t xml:space="preserve">Perception: </w:t>
       </w:r>
       <w:r>
-        <w:t>Perception turns text into sources: tokens (length ≥ 3) are matched by substring against node content, and matched nodes become sources with energy scaled by match count. Minimal — no embeddings — but it makes sources input-derived rather than hand-placed.</w:t>
+        <w:t>Perception turns text into sources: tokens (length ≥ 3) are matched by substring against node content, and matched nodes become sources with energy scaled by match count. Minimal: no embeddings, but it makes sources input-derived rather than hand-placed.</w:t>
       </w:r>
     </w:p>
     <w:p>
@@ -824,7 +824,7 @@
         <w:rPr>
           <w:b/>
         </w:rPr>
-        <w:t xml:space="preserve">The slice. </w:t>
+        <w:t xml:space="preserve">The slice: </w:t>
       </w:r>
       <w:r>
         <w:t>The slice (think) runs perceive → build field → form coalitions by basin → select the strongest coalition as “the thought.” The final step is an explicit placeholder for an unbuilt workspace-competition/broadcast phase. The slice is pure and deterministic; what it produces is not claimed to be meaningful (finding f).</w:t>
@@ -837,7 +837,7 @@
       <w:r>
         <w:drawing>
           <wp:inline xmlns:a="http://schemas.openxmlformats.org/drawingml/2006/main" xmlns:pic="http://schemas.openxmlformats.org/drawingml/2006/picture">
-            <wp:extent cx="4450177" cy="7315199"/>
+            <wp:extent cx="4414952" cy="7315200"/>
             <wp:docPr id="4" name="Picture 4"/>
             <wp:cNvGraphicFramePr>
               <a:graphicFrameLocks noChangeAspect="1"/>
@@ -858,7 +858,7 @@
                   <pic:spPr>
                     <a:xfrm>
                       <a:off x="0" y="0"/>
-                      <a:ext cx="4450177" cy="7315199"/>
+                      <a:ext cx="4414952" cy="7315200"/>
                     </a:xfrm>
                     <a:prstGeom prst="rect"/>
                   </pic:spPr>
@@ -879,7 +879,7 @@
           <w:i/>
           <w:sz w:val="18"/>
         </w:rPr>
-        <w:t>Figure 4 — End-to-end ‘thought’ slice. text → perceive → field → coalitions → thought. The final ‘strongest coalition = thought’ step is a placeholder for an unbuilt broadcast phase; the figure shows data flow, not that the resulting ‘thought’ is meaningful.</w:t>
+        <w:t>Figure 4: End-to-end ‘thought’ slice. text → perceive → field → coalitions → thought. The final ‘strongest coalition = thought’ step is a placeholder for an unbuilt broadcast phase; the figure shows data flow, not that the resulting ‘thought’ is meaningful.</w:t>
       </w:r>
     </w:p>
     <w:p>
@@ -898,7 +898,7 @@
         <w:rPr>
           <w:i w:val="0"/>
         </w:rPr>
-        <w:t>The thesis is that the test process — not the prototype — is the contribution. Two properties were treated as first-class and verified directly.</w:t>
+        <w:t>The thesis is that the test process (not the prototype) is the contribution. Two properties were treated as first-class and verified directly.</w:t>
       </w:r>
     </w:p>
     <w:p>
@@ -909,7 +909,7 @@
         <w:rPr>
           <w:b/>
         </w:rPr>
-        <w:t>Property-based / adversarial testing.</w:t>
+        <w:t>Property-based / adversarial testing:</w:t>
       </w:r>
       <w:r>
         <w:rPr>
@@ -926,7 +926,7 @@
         <w:rPr>
           <w:b/>
         </w:rPr>
-        <w:t>Determinism across processes.</w:t>
+        <w:t>Determinism across processes:</w:t>
       </w:r>
       <w:r>
         <w:rPr>
@@ -943,7 +943,7 @@
         <w:rPr>
           <w:b/>
         </w:rPr>
-        <w:t>Read-purity as an asserted invariant.</w:t>
+        <w:t>Read-purity as an asserted invariant:</w:t>
       </w:r>
       <w:r>
         <w:rPr>
@@ -960,7 +960,7 @@
         <w:rPr>
           <w:b/>
         </w:rPr>
-        <w:t>The harness, and a deliberate non-use of pytest.</w:t>
+        <w:t>The harness, and a deliberate non-use of pytest:</w:t>
       </w:r>
       <w:r>
         <w:rPr>
@@ -985,7 +985,7 @@
         <w:rPr>
           <w:i w:val="0"/>
         </w:rPr>
-        <w:t>Read findings (b)–(f) together and one shape repeats: a component passes on a friendly, hand-chosen input and fails on an adversarial or system-generated one. Each fix had two parts — write the test that tries to break the claim, and make the inputs system-generated rather than hand-chosen. The six findings are each presented as: claim under test → bug → root cause → fix → the specific test that now locks it. Reported magnitudes the shipped artifact does not let one reproduce are omitted rather than asserted.</w:t>
+        <w:t>Read findings (b)–(f) together and one shape repeats: a component passes on a friendly, hand-chosen input and fails on an adversarial or system-generated one. Each fix had two parts: write the test that tries to break the claim, and make the inputs system-generated rather than hand-chosen. The six findings are each presented as: claim under test → bug → root cause → fix → the specific test that now locks it. Reported magnitudes the shipped artifact does not let one reproduce are omitted rather than asserted.</w:t>
       </w:r>
     </w:p>
     <w:p>
@@ -1037,7 +1037,7 @@
           <w:i/>
           <w:sz w:val="18"/>
         </w:rPr>
-        <w:t>Figure 5 — The recurring ‘friendly-input’ failure mode, and the two remedies. Conceptual: the loop shared by findings (b)–(f), broken by adversarial testing and by closing the loop. It illustrates the method; it asserts no measurement.</w:t>
+        <w:t>Figure 5: The recurring ‘friendly-input’ failure mode, and the two remedies. Conceptual: the loop shared by findings (b)–(f), broken by adversarial testing and by closing the loop. It illustrates the method; it asserts no measurement.</w:t>
       </w:r>
     </w:p>
     <w:p>
@@ -1097,7 +1097,7 @@
           <w:i/>
           <w:sz w:val="18"/>
         </w:rPr>
-        <w:t>Figure 6 — The six structural findings at a glance. Each row: claim → bug → root cause → fix → locking test. Every cell traces to a module docstring and a named test; no error magnitudes are asserted.</w:t>
+        <w:t>Figure 6: The six structural findings at a glance. Each row: claim → bug → root cause → fix → locking test. Every cell traces to a module docstring and a named test; no error magnitudes are asserted.</w:t>
       </w:r>
     </w:p>
     <w:p>
@@ -1242,7 +1242,7 @@
           <w:i/>
           <w:sz w:val="18"/>
         </w:rPr>
-        <w:t>Figure 7 — A road’s closure lifecycle (finding (a) invariant). Open/Closed transitions happen only on active crossings; time passing and reads never reopen a closed road. A mechanism property, asserted by test_closure_is_sticky.</w:t>
+        <w:t>Figure 7: A road’s closure lifecycle (finding (a) invariant). Open/Closed transitions happen only on active crossings; time passing and reads never reopen a closed road. A mechanism property, asserted by test_closure_is_sticky.</w:t>
       </w:r>
     </w:p>
     <w:p>
@@ -1318,7 +1318,7 @@
         <w:rPr>
           <w:i w:val="0"/>
         </w:rPr>
-        <w:t xml:space="preserve"> bounded single-expansion, hop-layered — each node expands exactly once carrying the full sum of paths of length ≤ its settle hop; equal-length convergence is exact.</w:t>
+        <w:t xml:space="preserve"> bounded single-expansion, hop-layered: each node expands exactly once carrying the full sum of paths of length ≤ its settle hop; equal-length convergence is exact.</w:t>
       </w:r>
     </w:p>
     <w:p>
@@ -1387,7 +1387,7 @@
           <w:i/>
           <w:sz w:val="18"/>
         </w:rPr>
-        <w:t>Figure 8 — Convergence double-counting, before/after (finding (b)). Structural schematic of the diamond-with-tail: naive re-expansion over-counts everything downstream of the convergence node; single-expansion counts it once. No magnitudes are shown (the report omits them as not reproducible).</w:t>
+        <w:t>Figure 8: Convergence double-counting, before/after (finding (b)). Structural schematic of the diamond-with-tail: naive re-expansion over-counts everything downstream of the convergence node; single-expansion counts it once. No magnitudes are shown (the report omits them as not reproducible).</w:t>
       </w:r>
     </w:p>
     <w:p>
@@ -1429,7 +1429,7 @@
         <w:rPr>
           <w:i w:val="0"/>
         </w:rPr>
-        <w:t xml:space="preserve"> an activation-priority frontier made which late ripple was dropped depend on incidental edge-strength ordering; and with same-hop edges, which sibling expanded first was decided by iterating a set of uuids — order randomized per process by PYTHONHASHSEED — so results swung across runs.</w:t>
+        <w:t xml:space="preserve"> an activation-priority frontier made which late ripple was dropped depend on incidental edge-strength ordering; and with same-hop edges, which sibling expanded first was decided by iterating a set of uuids: order randomized per process by PYTHONHASHSEED, so results swung across runs.</w:t>
       </w:r>
     </w:p>
     <w:p>
@@ -1522,7 +1522,7 @@
         <w:rPr>
           <w:i w:val="0"/>
         </w:rPr>
-        <w:t xml:space="preserve"> coalition ordering and representative selection tie-broke on the node id — but ids are uuid4, regenerated every run, so any tiebreak falling back to the id was nondeterministic across processes even when the structure was identical.</w:t>
+        <w:t xml:space="preserve"> coalition ordering and representative selection tie-broke on the node id, but ids are uuid4, regenerated every run, so any tiebreak falling back to the id was nondeterministic across processes even when the structure was identical.</w:t>
       </w:r>
     </w:p>
     <w:p>
@@ -1718,7 +1718,7 @@
           <w:i/>
           <w:sz w:val="18"/>
         </w:rPr>
-        <w:t>Figure 9 — Single-seed degeneracy vs. multi-source basins (finding (e)). The same two-communities-with-a-thin-bridge graph: one seed yields a single distance-keyed blob; two sources yield two basins with the bridge as the seam. The multi-source recovery is the asserted acceptance test — in which the two sources are placed one per community (see finding (f) for why that matters).</w:t>
+        <w:t>Figure 9: Single-seed degeneracy vs. multi-source basins (finding (e)). The same two-communities-with-a-thin-bridge graph: one seed yields a single distance-keyed blob; two sources yield two basins with the bridge as the seam. The multi-source recovery is the asserted acceptance test: in which the two sources are placed one per community (see finding (f) for why that matters).</w:t>
       </w:r>
     </w:p>
     <w:p>
@@ -1760,7 +1760,7 @@
         <w:rPr>
           <w:i w:val="0"/>
         </w:rPr>
-        <w:t xml:space="preserve"> every layer above the substrate had been validated against a fiction of what would feed it. Sources were hand-placed, culminating in the field acceptance test recovering two communities only because one source was hand-placed at the center of each — the answer was encoded in the input. (test_acceptance_multisource_recovers_communities does place one source per community by hand; it is honest as a mechanism test and would be dishonest if read as evidence the system finds communities on its own.)</w:t>
+        <w:t xml:space="preserve"> every layer above the substrate had been validated against a fiction of what would feed it. Sources were hand-placed, culminating in the field acceptance test recovering two communities only because one source was hand-placed at the center of each: the answer was encoded in the input. (test_acceptance_multisource_recovers_communities does place one source per community by hand; it is honest as a mechanism test and would be dishonest if read as evidence the system finds communities on its own.)</w:t>
       </w:r>
     </w:p>
     <w:p>
@@ -1863,7 +1863,7 @@
           <w:i/>
           <w:sz w:val="18"/>
         </w:rPr>
-        <w:t>Figure 10 — The cognitive-layer arc and its dead-ends. connectivity binding → flow-cut → multi-source field → closed-loop, and what each step revealed (findings e, f), ending at the known limitation. It documents the development path, not a working capability.</w:t>
+        <w:t>Figure 10: The cognitive-layer arc and its dead-ends. connectivity binding → flow-cut → multi-source field → closed-loop, and what each step revealed (findings e, f), ending at the known limitation. It documents the development path, not a working capability.</w:t>
       </w:r>
     </w:p>
     <w:p>
@@ -1899,7 +1899,7 @@
         <w:spacing w:after="60"/>
       </w:pPr>
       <w:r>
-        <w:t>Test the property, not the example — assert purity, determinism, and “no double-count” directly and across processes, not by spot-checking outputs.</w:t>
+        <w:t>Test the property, not the example: assert purity, determinism, and “no double-count” directly and across processes, not by spot-checking outputs.</w:t>
       </w:r>
     </w:p>
     <w:p>
@@ -1908,7 +1908,7 @@
         <w:spacing w:after="60"/>
       </w:pPr>
       <w:r>
-        <w:t>Randomize what you assume is fixed — running under multiple PYTHONHASHSEED values is what makes uuid-set nondeterminism observable.</w:t>
+        <w:t>Randomize what you assume is fixed: running under multiple PYTHONHASHSEED values is what makes uuid-set nondeterminism observable.</w:t>
       </w:r>
     </w:p>
     <w:p>
@@ -1917,7 +1917,7 @@
         <w:spacing w:after="60"/>
       </w:pPr>
       <w:r>
-        <w:t>Close the loop — let a stage’s inputs be produced by the stage below it; hand-chosen inputs hide both degeneracy and circularity.</w:t>
+        <w:t>Close the loop: let a stage’s inputs be produced by the stage below it; hand-chosen inputs hide both degeneracy and circularity.</w:t>
       </w:r>
     </w:p>
     <w:p>
@@ -1926,7 +1926,7 @@
         <w:spacing w:after="60"/>
       </w:pPr>
       <w:r>
-        <w:t>Encode known limitations as asserted tests — a negative result written as a failing-on-purpose assertion is a standing, checkable claim, not a comment that rots.</w:t>
+        <w:t>Encode known limitations as asserted tests: a negative result written as a failing-on-purpose assertion is a standing, checkable claim, not a comment that rots.</w:t>
       </w:r>
     </w:p>
     <w:p>
@@ -1953,7 +1953,7 @@
         <w:rPr>
           <w:i w:val="0"/>
         </w:rPr>
-        <w:t>For the substrate store and the spreading-activation engine, the test suite establishes, as runnable checks: determinism (identical output across process runs, confirmed in fresh interpreters under the hash seeds in §4); integrity (graph indices stay mutually consistent across every mutation; a full scan finds no drift); and purity (reads never mutate stored state). These are claims about mechanism — the code does exactly and only what it says, reproducibly — not that the mechanism reproduces any cognitive phenomenon.</w:t>
+        <w:t>For the substrate store and the spreading-activation engine, the test suite establishes, as runnable checks: determinism (identical output across process runs, confirmed in fresh interpreters under the hash seeds in §4); integrity (graph indices stay mutually consistent across every mutation; a full scan finds no drift); and purity (reads never mutate stored state). These are claims about mechanism: the code does exactly and only what it says, reproducibly, not that the mechanism reproduces any cognitive phenomenon.</w:t>
       </w:r>
     </w:p>
     <w:p>
@@ -2005,7 +2005,7 @@
           <w:i/>
           <w:sz w:val="18"/>
         </w:rPr>
-        <w:t>Figure 11 — Adversarial determinism across process hash seeds (before/after). AFTER is the asserted, byte-identical result of the four determinism tests (each across its own seed set); BEFORE is the documented prior bug (findings c, d), shown qualitatively and NOT re-measured. Reproducibility of mechanism only — not cognition.</w:t>
+        <w:t>Figure 11: Adversarial determinism across process hash seeds (before/after). AFTER is the asserted, byte-identical result of the four determinism tests (each across its own seed set); BEFORE is the documented prior bug (findings c, d), shown qualitatively and NOT re-measured. Reproducibility of mechanism only, not cognition.</w:t>
       </w:r>
     </w:p>
     <w:p>
@@ -2511,7 +2511,7 @@
           <w:i/>
           <w:sz w:val="18"/>
         </w:rPr>
-        <w:t>Figure 12 — Passing assertions per suite (130 total, 0 failed). Counts taken verbatim from docs/TEST_OUTPUT.txt. Proves mechanism (and the mechanics of the exploratory layers); it does NOT measure cognitive quality. The proven/exploratory colouring matches Figure 1.</w:t>
+        <w:t>Figure 12: Passing assertions per suite (130 total, 0 failed). Counts taken verbatim from docs/TEST_OUTPUT.txt. Proves mechanism (and the mechanics of the exploratory layers); it does NOT measure cognitive quality. The proven/exploratory colouring matches Figure 1.</w:t>
       </w:r>
     </w:p>
     <w:p>
@@ -2582,7 +2582,7 @@
           <w:i/>
           <w:sz w:val="18"/>
         </w:rPr>
-        <w:t>Figure 13 — The closed-loop slice and its honest failure (finding (f); asserted NEGATIVE result). On the real input ‘coffee in the kitchen this morning,’ the ‘thought’ over-swallows across domains (pulls in work/code) and same-domain perceived sources strand as singleton basins, asserted by test_KNOWN_LIMITATION_clustered_sources_give_poor_basins. A documented known limitation, not a capability.</w:t>
+        <w:t>Figure 13: The closed-loop slice and its honest failure (finding (f); asserted NEGATIVE result). On the real input ‘coffee in the kitchen this morning,’ the ‘thought’ over-swallows across domains (pulls in work/code) and same-domain perceived sources strand as singleton basins, asserted by test_KNOWN_LIMITATION_clustered_sources_give_poor_basins. A documented known limitation, not a capability.</w:t>
       </w:r>
     </w:p>
     <w:p>
@@ -2682,7 +2682,7 @@
         <w:rPr>
           <w:i w:val="0"/>
         </w:rPr>
-        <w:t>The natural next step is to stop validating the cognitive layer against hand-built inputs and instead validate it against a measurable cognitive effect whose direction is known independently of Nous. Semantic priming is the worked example: in human studies, recognizing a target word is faster when preceded by a related prime than an unrelated one [11], which the spreading-activation account explains via pre-activation spreading to related concepts [10]. A priming-style protocol for Nous would pre-activate a related concept and test whether the target’s activation is measurably raised relative to an unrelated control — a directional prediction made before running the system, so the input is no longer chosen to make the answer come out right. Two further items follow directly from the findings:</w:t>
+        <w:t>The natural next step is to stop validating the cognitive layer against hand-built inputs and instead validate it against a measurable cognitive effect whose direction is known independently of Nous. Semantic priming is the worked example: in human studies, recognizing a target word is faster when preceded by a related prime than an unrelated one [11], which the spreading-activation account explains via pre-activation spreading to related concepts [10]. A priming-style protocol for Nous would pre-activate a related concept and test whether the target’s activation is measurably raised relative to an unrelated control: a directional prediction made before running the system, so the input is no longer chosen to make the answer come out right. Two further items follow directly from the findings:</w:t>
       </w:r>
     </w:p>
     <w:p>
@@ -2719,7 +2719,7 @@
         <w:rPr>
           <w:i w:val="0"/>
         </w:rPr>
-        <w:t>What was earned is concrete and modest: a correct, deterministic, integrity-preserving, and pure memory-and-activation substrate, built in dependency-free Python and shipped with the tests that prove those properties across process hash seeds — and, above it, an honestly-scoped exploratory layer whose one end-to-end behavioral probe is a documented negative result. The larger contribution is the method: adversarial/property-based testing and loop-closure caught six structural bugs that happy-path testing passes over, and the same discipline drew the boundary the project refuses to cross — proving mechanism while explicitly declining to claim cognition. What remains open is exactly what the method recommends next: evaluate the cognitive layer against an effect whose direction is known independently, fix the source-grouping degeneracy, and build the competition phase that would make the constants calibratable.</w:t>
+        <w:t>What was earned is concrete and modest: a correct, deterministic, integrity-preserving, and pure memory-and-activation substrate, built in dependency-free Python and shipped with the tests that prove those properties across process hash seeds, and, above it, an honestly-scoped exploratory layer whose one end-to-end behavioral probe is a documented negative result. The larger contribution is the method: adversarial/property-based testing and loop-closure caught six structural bugs that happy-path testing passes over, and the same discipline drew the boundary the project refuses to cross: proving mechanism while explicitly declining to claim cognition. What remains open is exactly what the method recommends next: evaluate the cognitive layer against an effect whose direction is known independently, fix the source-grouping degeneracy, and build the competition phase that would make the constants calibratable.</w:t>
       </w:r>
     </w:p>
     <w:p>
@@ -2847,7 +2847,7 @@
         <w:pStyle w:val="Heading1"/>
       </w:pPr>
       <w:r>
-        <w:t>Appendix A — Verbatim test output</w:t>
+        <w:t>Appendix A: Verbatim test output</w:t>
       </w:r>
     </w:p>
     <w:p>
@@ -2888,7 +2888,7 @@
         <w:pStyle w:val="Heading1"/>
       </w:pPr>
       <w:r>
-        <w:t>Appendix B — Reproduction</w:t>
+        <w:t>Appendix B: Reproduction</w:t>
       </w:r>
     </w:p>
     <w:p>
@@ -2926,7 +2926,7 @@
         <w:pStyle w:val="Heading1"/>
       </w:pPr>
       <w:r>
-        <w:t>Appendix C — Figure index and sources</w:t>
+        <w:t>Appendix C: Figure index and sources</w:t>
       </w:r>
     </w:p>
     <w:p>
@@ -3632,7 +3632,7 @@
           <w:i/>
           <w:sz w:val="18"/>
         </w:rPr>
-        <w:t>Figure 14 — Repository / asset map. Orientation only; it shows the package layout, not behavior.</w:t>
+        <w:t>Figure 14: Repository / asset map. Orientation only; it shows the package layout, not behavior.</w:t>
       </w:r>
     </w:p>
     <w:sectPr>

</xml_diff>